<commit_message>
test: add 5 transaction E2E tests, update spec doc (68 total tests)
- E2E: transactions list page loads with table
- E2E: transaction detail shows Commission Calculator and FICA Compliance
- E2E: transaction detail shows stage timeline, Parties, Sale Price
- E2E: transaction pipeline board loads with 9 stage columns
- E2E: dashboard transaction KPI cards visible
- All 17 E2E tests passing (was 12), 51 unit tests passing
- Updated spec doc test metrics and version history
</commit_message>
<xml_diff>
--- a/docs/Thina_CRM_System_Specification_v0.10.0.docx
+++ b/docs/Thina_CRM_System_Specification_v0.10.0.docx
@@ -12969,6 +12969,120 @@
                 <w:sz w:val="20"/>
                 <w:szCs w:val="20"/>
               </w:rPr>
+              <w:t xml:space="preserve">Transactions</w:t>
+            </w:r>
+          </w:p>
+        </w:tc>
+        <w:tc>
+          <w:p>
+            <w:r>
+              <w:rPr>
+                <w:rFonts w:ascii="Aptos" w:cs="Aptos" w:eastAsia="Aptos" w:hAnsi="Aptos"/>
+                <w:sz w:val="20"/>
+                <w:szCs w:val="20"/>
+              </w:rPr>
+              <w:t xml:space="preserve">Transaction list loads with table, detail page with Commission Calculator and FICA Compliance, stage timeline with Parties, Sale Price, Agent Net Commission</w:t>
+            </w:r>
+          </w:p>
+        </w:tc>
+        <w:tc>
+          <w:p>
+            <w:r>
+              <w:rPr>
+                <w:rFonts w:ascii="Aptos" w:cs="Aptos" w:eastAsia="Aptos" w:hAnsi="Aptos"/>
+                <w:sz w:val="20"/>
+                <w:szCs w:val="20"/>
+              </w:rPr>
+              <w:t xml:space="preserve">3</w:t>
+            </w:r>
+          </w:p>
+        </w:tc>
+      </w:tr>
+      <w:tr>
+        <w:tc>
+          <w:p>
+            <w:r>
+              <w:rPr>
+                <w:rFonts w:ascii="Aptos" w:cs="Aptos" w:eastAsia="Aptos" w:hAnsi="Aptos"/>
+                <w:sz w:val="20"/>
+                <w:szCs w:val="20"/>
+              </w:rPr>
+              <w:t xml:space="preserve">Transaction Pipeline</w:t>
+            </w:r>
+          </w:p>
+        </w:tc>
+        <w:tc>
+          <w:p>
+            <w:r>
+              <w:rPr>
+                <w:rFonts w:ascii="Aptos" w:cs="Aptos" w:eastAsia="Aptos" w:hAnsi="Aptos"/>
+                <w:sz w:val="20"/>
+                <w:szCs w:val="20"/>
+              </w:rPr>
+              <w:t xml:space="preserve">Pipeline board loads with 9 stage columns (OTP Signed, Bond Applied, Commission Paid)</w:t>
+            </w:r>
+          </w:p>
+        </w:tc>
+        <w:tc>
+          <w:p>
+            <w:r>
+              <w:rPr>
+                <w:rFonts w:ascii="Aptos" w:cs="Aptos" w:eastAsia="Aptos" w:hAnsi="Aptos"/>
+                <w:sz w:val="20"/>
+                <w:szCs w:val="20"/>
+              </w:rPr>
+              <w:t xml:space="preserve">1</w:t>
+            </w:r>
+          </w:p>
+        </w:tc>
+      </w:tr>
+      <w:tr>
+        <w:tc>
+          <w:p>
+            <w:r>
+              <w:rPr>
+                <w:rFonts w:ascii="Aptos" w:cs="Aptos" w:eastAsia="Aptos" w:hAnsi="Aptos"/>
+                <w:sz w:val="20"/>
+                <w:szCs w:val="20"/>
+              </w:rPr>
+              <w:t xml:space="preserve">Dashboard — Tx KPIs</w:t>
+            </w:r>
+          </w:p>
+        </w:tc>
+        <w:tc>
+          <w:p>
+            <w:r>
+              <w:rPr>
+                <w:rFonts w:ascii="Aptos" w:cs="Aptos" w:eastAsia="Aptos" w:hAnsi="Aptos"/>
+                <w:sz w:val="20"/>
+                <w:szCs w:val="20"/>
+              </w:rPr>
+              <w:t xml:space="preserve">Transaction KPI cards visible when transactions exist (Active Transactions, Pending/Expected/Earned Commission)</w:t>
+            </w:r>
+          </w:p>
+        </w:tc>
+        <w:tc>
+          <w:p>
+            <w:r>
+              <w:rPr>
+                <w:rFonts w:ascii="Aptos" w:cs="Aptos" w:eastAsia="Aptos" w:hAnsi="Aptos"/>
+                <w:sz w:val="20"/>
+                <w:szCs w:val="20"/>
+              </w:rPr>
+              <w:t xml:space="preserve">1</w:t>
+            </w:r>
+          </w:p>
+        </w:tc>
+      </w:tr>
+      <w:tr>
+        <w:tc>
+          <w:p>
+            <w:r>
+              <w:rPr>
+                <w:rFonts w:ascii="Aptos" w:cs="Aptos" w:eastAsia="Aptos" w:hAnsi="Aptos"/>
+                <w:sz w:val="20"/>
+                <w:szCs w:val="20"/>
+              </w:rPr>
               <w:t xml:space="preserve">Health API</w:t>
             </w:r>
           </w:p>
@@ -13010,7 +13124,7 @@
         <w:spacing w:after="120" w:before="300"/>
       </w:pPr>
       <w:r>
-        <w:t xml:space="preserve">9.4 Test Metrics (v0.8.1)</w:t>
+        <w:t xml:space="preserve">9.4 Test Metrics (v0.10.0)</w:t>
       </w:r>
     </w:p>
     <w:tbl>
@@ -13203,7 +13317,7 @@
                 <w:sz w:val="20"/>
                 <w:szCs w:val="20"/>
               </w:rPr>
-              <w:t xml:space="preserve">39</w:t>
+              <w:t xml:space="preserve">51</w:t>
             </w:r>
           </w:p>
         </w:tc>
@@ -13229,7 +13343,7 @@
                 <w:sz w:val="20"/>
                 <w:szCs w:val="20"/>
               </w:rPr>
-              <w:t xml:space="preserve">12</w:t>
+              <w:t xml:space="preserve">17</w:t>
             </w:r>
           </w:p>
         </w:tc>
@@ -13255,7 +13369,7 @@
                 <w:sz w:val="20"/>
                 <w:szCs w:val="20"/>
               </w:rPr>
-              <w:t xml:space="preserve">51</w:t>
+              <w:t xml:space="preserve">68</w:t>
             </w:r>
           </w:p>
         </w:tc>
@@ -13307,7 +13421,7 @@
                 <w:sz w:val="20"/>
                 <w:szCs w:val="20"/>
               </w:rPr>
-              <w:t xml:space="preserve">~2.3 seconds</w:t>
+              <w:t xml:space="preserve">~3.1 seconds</w:t>
             </w:r>
           </w:p>
         </w:tc>
@@ -13333,7 +13447,7 @@
                 <w:sz w:val="20"/>
                 <w:szCs w:val="20"/>
               </w:rPr>
-              <w:t xml:space="preserve">~1.2 minutes</w:t>
+              <w:t xml:space="preserve">~1.3 minutes</w:t>
             </w:r>
           </w:p>
         </w:tc>
@@ -15771,7 +15885,7 @@
                 <w:sz w:val="20"/>
                 <w:szCs w:val="20"/>
               </w:rPr>
-              <w:t xml:space="preserve">Dashboard Integration &amp; Won-Lead Flow — Integrated transaction KPIs into the dashboard (Active Transactions, Pending Commission, Expected Income, Earned Commission). Added won-lead-to-transaction flow: "Create Transaction" button on won lead detail pages and automatic prompt when dragging a lead to "won" on the pipeline board. Added transactions to command palette navigation and quick actions. Updated tests to 51 (12 new tests for commission calculator, transaction forecasting, transaction CRUD exports, and TRANSACTION_STAGES constant).</w:t>
+              <w:t xml:space="preserve">Dashboard Integration &amp; Won-Lead Flow — Integrated transaction KPIs into the dashboard (Active Transactions, Pending Commission, Expected Income, Earned Commission). Added won-lead-to-transaction flow: "Create Transaction" button on won lead detail pages and automatic prompt when dragging a lead to "won" on the pipeline board. Added transactions to command palette navigation and quick actions. Added 5 Playwright E2E tests for transaction pages (list, detail, pipeline, dashboard KPIs). Updated tests to 68 total (51 Vitest + 17 Playwright E2E).</w:t>
             </w:r>
           </w:p>
         </w:tc>
@@ -16758,7 +16872,7 @@
           <w:sz w:val="22"/>
           <w:szCs w:val="22"/>
         </w:rPr>
-        <w:t xml:space="preserve">app.spec.ts — Functional E2E tests: auth, dashboard, leads, contacts, pipeline, tasks, reports, health API (12 tests)</w:t>
+        <w:t xml:space="preserve">app.spec.ts — Functional E2E tests: auth, dashboard, leads, contacts, pipeline, tasks, reports, transactions, transaction pipeline, dashboard tx KPIs, health API (17 tests)</w:t>
       </w:r>
     </w:p>
     <w:p>

</xml_diff>